<commit_message>
Fix backend folder tracking
</commit_message>
<xml_diff>
--- a/MERN_TRAINING1.docx
+++ b/MERN_TRAINING1.docx
@@ -20259,9 +20259,26 @@
       </w:r>
     </w:p>
     <w:p>
-      <w:r>
+      <w:pPr>
+        <w:rPr>
+          <w:b/>
+          <w:bCs/>
+        </w:rPr>
+      </w:pPr>
+      <w:r>
+        <w:rPr>
+          <w:b/>
+          <w:bCs/>
+        </w:rPr>
         <w:t xml:space="preserve">Creation of Backend </w:t>
       </w:r>
+      <w:r>
+        <w:rPr>
+          <w:b/>
+          <w:bCs/>
+        </w:rPr>
+        <w:t>Order</w:t>
+      </w:r>
     </w:p>
     <w:p>
       <w:r>
@@ -20269,7 +20286,17 @@
       </w:r>
     </w:p>
     <w:p>
-      <w:r>
+      <w:pPr>
+        <w:rPr>
+          <w:b/>
+          <w:bCs/>
+        </w:rPr>
+      </w:pPr>
+      <w:r>
+        <w:rPr>
+          <w:b/>
+          <w:bCs/>
+        </w:rPr>
         <w:t>Workflow</w:t>
       </w:r>
     </w:p>
@@ -20278,6 +20305,39 @@
         <w:t>Server-&gt;Router-&gt;Controller</w:t>
       </w:r>
     </w:p>
+    <w:p>
+      <w:r>
+        <w:t>Request-&gt;Routes-&gt;Controller-&gt;Response</w:t>
+      </w:r>
+    </w:p>
+    <w:p>
+      <w:pPr>
+        <w:rPr>
+          <w:b/>
+          <w:bCs/>
+        </w:rPr>
+      </w:pPr>
+      <w:r>
+        <w:rPr>
+          <w:b/>
+          <w:bCs/>
+        </w:rPr>
+        <w:t>If Middleware Present</w:t>
+      </w:r>
+    </w:p>
+    <w:p>
+      <w:r>
+        <w:t>Request-&gt;</w:t>
+      </w:r>
+      <w:r>
+        <w:t>Middleware-&gt;</w:t>
+      </w:r>
+      <w:r>
+        <w:t>Routes-&gt;Controller-&gt;Response</w:t>
+      </w:r>
+    </w:p>
+    <w:p/>
+    <w:p/>
     <w:p/>
     <w:p>
       <w:pPr>
@@ -20446,6 +20506,7 @@
           <w:sz w:val="20"/>
           <w:szCs w:val="20"/>
         </w:rPr>
+        <w:lastRenderedPageBreak/>
         <w:t>//It makes the values written in .env available through process.env.</w:t>
       </w:r>
     </w:p>
@@ -20529,7 +20590,6 @@
           <w:sz w:val="20"/>
           <w:szCs w:val="20"/>
         </w:rPr>
-        <w:lastRenderedPageBreak/>
         <w:t>mongoose.connect(process.env.MONGO_URI)</w:t>
       </w:r>
     </w:p>
@@ -29354,6 +29414,7 @@
   <w:style w:type="character" w:default="1" w:styleId="DefaultParagraphFont">
     <w:name w:val="Default Paragraph Font"/>
     <w:uiPriority w:val="1"/>
+    <w:semiHidden/>
     <w:unhideWhenUsed/>
   </w:style>
   <w:style w:type="table" w:default="1" w:styleId="TableNormal">

</xml_diff>